<commit_message>
Updated template to add descriptions for sections
</commit_message>
<xml_diff>
--- a/doc/development/DME Design Doc Template.docx
+++ b/doc/development/DME Design Doc Template.docx
@@ -1,6 +1,6 @@
 
 <file path=word/document.xml><?xml version="1.0" encoding="utf-8"?>
-<w:document xmlns:wpc="http://schemas.microsoft.com/office/word/2010/wordprocessingCanvas" xmlns:cx="http://schemas.microsoft.com/office/drawing/2014/chartex" xmlns:cx1="http://schemas.microsoft.com/office/drawing/2015/9/8/chartex" xmlns:cx2="http://schemas.microsoft.com/office/drawing/2015/10/21/chartex" xmlns:cx3="http://schemas.microsoft.com/office/drawing/2016/5/9/chartex" xmlns:cx4="http://schemas.microsoft.com/office/drawing/2016/5/10/chartex" xmlns:cx5="http://schemas.microsoft.com/office/drawing/2016/5/11/chartex" xmlns:cx6="http://schemas.microsoft.com/office/drawing/2016/5/12/chartex" xmlns:cx7="http://schemas.microsoft.com/office/drawing/2016/5/13/chartex" xmlns:cx8="http://schemas.microsoft.com/office/drawing/2016/5/14/chartex" xmlns:mc="http://schemas.openxmlformats.org/markup-compatibility/2006" xmlns:aink="http://schemas.microsoft.com/office/drawing/2016/ink" xmlns:am3d="http://schemas.microsoft.com/office/drawing/2017/model3d" xmlns:o="urn:schemas-microsoft-com:office:office" xmlns:oel="http://schemas.microsoft.com/office/2019/extlst" xmlns:r="http://schemas.openxmlformats.org/officeDocument/2006/relationships" xmlns:m="http://schemas.openxmlformats.org/officeDocument/2006/math" xmlns:v="urn:schemas-microsoft-com:vml" xmlns:wp14="http://schemas.microsoft.com/office/word/2010/wordprocessingDrawing" xmlns:wp="http://schemas.openxmlformats.org/drawingml/2006/wordprocessingDrawing" xmlns:w10="urn:schemas-microsoft-com:office:word" xmlns:w="http://schemas.openxmlformats.org/wordprocessingml/2006/main" xmlns:w14="http://schemas.microsoft.com/office/word/2010/wordml" xmlns:w15="http://schemas.microsoft.com/office/word/2012/wordml" xmlns:w16cex="http://schemas.microsoft.com/office/word/2018/wordml/cex" xmlns:w16cid="http://schemas.microsoft.com/office/word/2016/wordml/cid" xmlns:w16="http://schemas.microsoft.com/office/word/2018/wordml" xmlns:w16du="http://schemas.microsoft.com/office/word/2023/wordml/word16du" xmlns:w16sdtdh="http://schemas.microsoft.com/office/word/2020/wordml/sdtdatahash" xmlns:w16sdtfl="http://schemas.microsoft.com/office/word/2024/wordml/sdtformatlock" xmlns:w16se="http://schemas.microsoft.com/office/word/2015/wordml/symex" xmlns:wpg="http://schemas.microsoft.com/office/word/2010/wordprocessingGroup" xmlns:wpi="http://schemas.microsoft.com/office/word/2010/wordprocessingInk" xmlns:wne="http://schemas.microsoft.com/office/word/2006/wordml" xmlns:wps="http://schemas.microsoft.com/office/word/2010/wordprocessingShape" mc:Ignorable="w14 w15 w16se w16cid w16 w16cex w16sdtdh w16sdtfl w16du wp14">
+<w:document xmlns:wpc="http://schemas.microsoft.com/office/word/2010/wordprocessingCanvas" xmlns:cx="http://schemas.microsoft.com/office/drawing/2014/chartex" xmlns:cx1="http://schemas.microsoft.com/office/drawing/2015/9/8/chartex" xmlns:cx2="http://schemas.microsoft.com/office/drawing/2015/10/21/chartex" xmlns:cx3="http://schemas.microsoft.com/office/drawing/2016/5/9/chartex" xmlns:cx4="http://schemas.microsoft.com/office/drawing/2016/5/10/chartex" xmlns:cx5="http://schemas.microsoft.com/office/drawing/2016/5/11/chartex" xmlns:cx6="http://schemas.microsoft.com/office/drawing/2016/5/12/chartex" xmlns:cx7="http://schemas.microsoft.com/office/drawing/2016/5/13/chartex" xmlns:cx8="http://schemas.microsoft.com/office/drawing/2016/5/14/chartex" xmlns:mc="http://schemas.openxmlformats.org/markup-compatibility/2006" xmlns:m="http://schemas.openxmlformats.org/officeDocument/2006/math" xmlns:aink="http://schemas.microsoft.com/office/drawing/2016/ink" xmlns:am3d="http://schemas.microsoft.com/office/drawing/2017/model3d" xmlns:oel="http://schemas.microsoft.com/office/2019/extlst" xmlns:r="http://schemas.openxmlformats.org/officeDocument/2006/relationships" xmlns:wp14="http://schemas.microsoft.com/office/word/2010/wordprocessingDrawing" xmlns:wp="http://schemas.openxmlformats.org/drawingml/2006/wordprocessingDrawing" xmlns:wpg="http://schemas.microsoft.com/office/word/2010/wordprocessingGroup" xmlns:wpi="http://schemas.microsoft.com/office/word/2010/wordprocessingInk" xmlns:wps="http://schemas.microsoft.com/office/word/2010/wordprocessingShape" xmlns:o="urn:schemas-microsoft-com:office:office" xmlns:v="urn:schemas-microsoft-com:vml" xmlns:w10="urn:schemas-microsoft-com:office:word" xmlns:w="http://schemas.openxmlformats.org/wordprocessingml/2006/main" xmlns:w14="http://schemas.microsoft.com/office/word/2010/wordml" xmlns:w15="http://schemas.microsoft.com/office/word/2012/wordml" xmlns:w16cei="http://schemas.microsoft.com/office/word/2026/wordml/cei" xmlns:w16cex="http://schemas.microsoft.com/office/word/2018/wordml/cex" xmlns:w16cid="http://schemas.microsoft.com/office/word/2016/wordml/cid" xmlns:w16="http://schemas.microsoft.com/office/word/2018/wordml" xmlns:w16sdtdh="http://schemas.microsoft.com/office/word/2020/wordml/sdtdatahash" xmlns:w16sdtfl="http://schemas.microsoft.com/office/word/2024/wordml/sdtformatlock" xmlns:w16se="http://schemas.microsoft.com/office/word/2015/wordml/symex" xmlns:w16du="http://schemas.microsoft.com/office/word/2023/wordml/word16du" xmlns:wne="http://schemas.microsoft.com/office/word/2006/wordml" mc:Ignorable="w14 w15 w16se w16cid w16 w16cex w16sdtdh w16sdtfl w16du wp14">
   <w:body>
     <w:p/>
     <w:p>
@@ -1881,6 +1881,12 @@
     </w:sdt>
     <w:p/>
     <w:p/>
+    <w:p/>
+    <w:p/>
+    <w:p/>
+    <w:p/>
+    <w:p/>
+    <w:p/>
     <w:p>
       <w:pPr>
         <w:pStyle w:val="Heading1"/>
@@ -1902,6 +1908,31 @@
       </w:r>
       <w:bookmarkEnd w:id="2"/>
     </w:p>
+    <w:p/>
+    <w:p>
+      <w:r>
+        <w:t>Describe the purpose of this design document (e.g. to describe the design for XYZ capability)</w:t>
+      </w:r>
+      <w:r>
+        <w:t>. Indicate</w:t>
+      </w:r>
+      <w:r>
+        <w:t xml:space="preserve"> the JIRA ticket</w:t>
+      </w:r>
+      <w:r>
+        <w:t>(s)</w:t>
+      </w:r>
+      <w:r>
+        <w:t xml:space="preserve"> containing the requirement for this design</w:t>
+      </w:r>
+      <w:r>
+        <w:t xml:space="preserve"> if applicable</w:t>
+      </w:r>
+      <w:r>
+        <w:t xml:space="preserve">. </w:t>
+      </w:r>
+    </w:p>
+    <w:p/>
     <w:p>
       <w:pPr>
         <w:pStyle w:val="Heading2"/>
@@ -1913,6 +1944,12 @@
       <w:bookmarkEnd w:id="3"/>
     </w:p>
     <w:p>
+      <w:r>
+        <w:t xml:space="preserve">Provide the context and motivation for this change i.e., briefly explain existing behavior/capability related to this feature, and describe what problem is being solved or what feature is being added. </w:t>
+      </w:r>
+    </w:p>
+    <w:p/>
+    <w:p>
       <w:pPr>
         <w:pStyle w:val="Heading2"/>
       </w:pPr>
@@ -1923,6 +1960,12 @@
       <w:bookmarkEnd w:id="4"/>
     </w:p>
     <w:p>
+      <w:r>
+        <w:t xml:space="preserve">Describe the boundaries of this feature. Indicate what problem it does not solve or capability it does not provide with respect to the current context. </w:t>
+      </w:r>
+    </w:p>
+    <w:p/>
+    <w:p>
       <w:pPr>
         <w:pStyle w:val="Heading2"/>
       </w:pPr>
@@ -1933,6 +1976,12 @@
       <w:bookmarkEnd w:id="5"/>
     </w:p>
     <w:p>
+      <w:r>
+        <w:t>Indicate the entry criteria for this feature to work. This includes assumptions about any special hardware setup, software configuration, or system performance.</w:t>
+      </w:r>
+    </w:p>
+    <w:p/>
+    <w:p>
       <w:pPr>
         <w:pStyle w:val="Heading2"/>
       </w:pPr>
@@ -1943,6 +1992,12 @@
       <w:bookmarkEnd w:id="6"/>
     </w:p>
     <w:p>
+      <w:r>
+        <w:t>Indicate the boundaries or rules that will limit how this feature will work or be developed</w:t>
+      </w:r>
+    </w:p>
+    <w:p/>
+    <w:p>
       <w:pPr>
         <w:pStyle w:val="Heading1"/>
       </w:pPr>
@@ -1963,11 +2018,18 @@
       <w:bookmarkEnd w:id="8"/>
     </w:p>
     <w:p>
+      <w:r>
+        <w:t>Indicate what changes, if any are required to existing hardware e.g. new VM or server, additional memory, CPUs etc.</w:t>
+      </w:r>
+    </w:p>
+    <w:p/>
+    <w:p>
       <w:pPr>
         <w:pStyle w:val="Heading2"/>
       </w:pPr>
       <w:bookmarkStart w:id="9" w:name="_Toc179816678"/>
       <w:r>
+        <w:lastRenderedPageBreak/>
         <w:t xml:space="preserve">Software </w:t>
       </w:r>
       <w:r>
@@ -1976,6 +2038,12 @@
       <w:bookmarkEnd w:id="9"/>
     </w:p>
     <w:p>
+      <w:r>
+        <w:t>Provide the high-level breakdown of the major architecture changes. Indicate how the structure, services or data flows were modified.</w:t>
+      </w:r>
+    </w:p>
+    <w:p/>
+    <w:p>
       <w:pPr>
         <w:pStyle w:val="Heading1"/>
       </w:pPr>
@@ -1991,10 +2059,16 @@
       </w:pPr>
       <w:bookmarkStart w:id="11" w:name="_Toc179816680"/>
       <w:r>
-        <w:t>Introduction</w:t>
+        <w:t>Overview</w:t>
       </w:r>
       <w:bookmarkEnd w:id="11"/>
     </w:p>
+    <w:p>
+      <w:r>
+        <w:t>Provide an overview of the design. This section gives a bird’s eye view of how the feature is implemented through the changes described in the following sections.</w:t>
+      </w:r>
+    </w:p>
+    <w:p/>
     <w:p>
       <w:pPr>
         <w:pStyle w:val="Heading2"/>
@@ -2009,10 +2083,57 @@
       <w:bookmarkEnd w:id="12"/>
     </w:p>
     <w:p>
+      <w:r>
+        <w:t>De</w:t>
+      </w:r>
+      <w:r>
+        <w:t xml:space="preserve">scribe </w:t>
+      </w:r>
+      <w:r>
+        <w:t xml:space="preserve">core algorithms and logic changes. </w:t>
+      </w:r>
+      <w:r>
+        <w:t>Provide d</w:t>
+      </w:r>
+      <w:r>
+        <w:t>etailed component modifications with path, description of change and purpose</w:t>
+      </w:r>
+      <w:r>
+        <w:t xml:space="preserve"> in tabular or list format</w:t>
+      </w:r>
+      <w:r>
+        <w:t xml:space="preserve">. </w:t>
+      </w:r>
+      <w:r>
+        <w:t>Separate the server side and web</w:t>
+      </w:r>
+      <w:r>
+        <w:t xml:space="preserve"> tables/lists</w:t>
+      </w:r>
+      <w:r>
+        <w:t xml:space="preserve">. </w:t>
+      </w:r>
+    </w:p>
+    <w:p/>
+    <w:p>
       <w:pPr>
         <w:pStyle w:val="Heading2"/>
       </w:pPr>
       <w:bookmarkStart w:id="13" w:name="_Toc179816682"/>
+      <w:r>
+        <w:t>API Design</w:t>
+      </w:r>
+    </w:p>
+    <w:p>
+      <w:r>
+        <w:t>Describe all new APIs or changes to existing APIs.  Provide the URL, method, and all path and query parameters.</w:t>
+      </w:r>
+    </w:p>
+    <w:p/>
+    <w:p>
+      <w:pPr>
+        <w:pStyle w:val="Heading2"/>
+      </w:pPr>
       <w:r>
         <w:t>User Interface</w:t>
       </w:r>
@@ -2022,11 +2143,33 @@
       <w:bookmarkEnd w:id="13"/>
     </w:p>
     <w:p>
+      <w:r>
+        <w:t xml:space="preserve">Describe </w:t>
+      </w:r>
+      <w:r>
+        <w:t xml:space="preserve">all the </w:t>
+      </w:r>
+      <w:r>
+        <w:t>screen and navigation changes</w:t>
+      </w:r>
+      <w:r>
+        <w:t xml:space="preserve"> including any new links, menu items, fields and messages</w:t>
+      </w:r>
+      <w:r>
+        <w:t>.</w:t>
+      </w:r>
+      <w:r>
+        <w:t xml:space="preserve"> </w:t>
+      </w:r>
+    </w:p>
+    <w:p/>
+    <w:p>
       <w:pPr>
         <w:pStyle w:val="Heading2"/>
       </w:pPr>
       <w:bookmarkStart w:id="14" w:name="_Toc179816683"/>
       <w:r>
+        <w:lastRenderedPageBreak/>
         <w:t>System Integration</w:t>
       </w:r>
       <w:bookmarkEnd w:id="14"/>
@@ -2046,10 +2189,40 @@
         <w:pStyle w:val="Heading2"/>
       </w:pPr>
       <w:bookmarkStart w:id="16" w:name="_Toc179816685"/>
+      <w:bookmarkStart w:id="17" w:name="OLE_LINK2"/>
       <w:r>
-        <w:t>Table Design</w:t>
+        <w:t>Database Objects</w:t>
       </w:r>
       <w:bookmarkEnd w:id="16"/>
+    </w:p>
+    <w:p>
+      <w:r>
+        <w:t xml:space="preserve">Describe all new database objects (Tables/Views/MVs). Indicate purpose for </w:t>
+      </w:r>
+      <w:r>
+        <w:t>each and</w:t>
+      </w:r>
+      <w:r>
+        <w:t xml:space="preserve"> describe each column with data type. Describe changes to existing database objects– indicate reason for change and describe the new column with data type. </w:t>
+      </w:r>
+      <w:r>
+        <w:t>Indicate if any Sequences are being added.</w:t>
+      </w:r>
+    </w:p>
+    <w:p/>
+    <w:p>
+      <w:pPr>
+        <w:pStyle w:val="Heading2"/>
+      </w:pPr>
+      <w:r>
+        <w:t>Stored Programs</w:t>
+      </w:r>
+      <w:bookmarkEnd w:id="17"/>
+    </w:p>
+    <w:p>
+      <w:r>
+        <w:t xml:space="preserve">Describe all the stored procedures and functions, with the name and description for each. </w:t>
+      </w:r>
     </w:p>
     <w:sectPr>
       <w:headerReference w:type="default" r:id="rId8"/>
@@ -2067,7 +2240,7 @@
 </file>
 
 <file path=word/endnotes.xml><?xml version="1.0" encoding="utf-8"?>
-<w:endnotes xmlns:wpc="http://schemas.microsoft.com/office/word/2010/wordprocessingCanvas" xmlns:cx="http://schemas.microsoft.com/office/drawing/2014/chartex" xmlns:cx1="http://schemas.microsoft.com/office/drawing/2015/9/8/chartex" xmlns:cx2="http://schemas.microsoft.com/office/drawing/2015/10/21/chartex" xmlns:cx3="http://schemas.microsoft.com/office/drawing/2016/5/9/chartex" xmlns:cx4="http://schemas.microsoft.com/office/drawing/2016/5/10/chartex" xmlns:cx5="http://schemas.microsoft.com/office/drawing/2016/5/11/chartex" xmlns:cx6="http://schemas.microsoft.com/office/drawing/2016/5/12/chartex" xmlns:cx7="http://schemas.microsoft.com/office/drawing/2016/5/13/chartex" xmlns:cx8="http://schemas.microsoft.com/office/drawing/2016/5/14/chartex" xmlns:mc="http://schemas.openxmlformats.org/markup-compatibility/2006" xmlns:aink="http://schemas.microsoft.com/office/drawing/2016/ink" xmlns:am3d="http://schemas.microsoft.com/office/drawing/2017/model3d" xmlns:o="urn:schemas-microsoft-com:office:office" xmlns:oel="http://schemas.microsoft.com/office/2019/extlst" xmlns:r="http://schemas.openxmlformats.org/officeDocument/2006/relationships" xmlns:m="http://schemas.openxmlformats.org/officeDocument/2006/math" xmlns:v="urn:schemas-microsoft-com:vml" xmlns:wp14="http://schemas.microsoft.com/office/word/2010/wordprocessingDrawing" xmlns:wp="http://schemas.openxmlformats.org/drawingml/2006/wordprocessingDrawing" xmlns:w10="urn:schemas-microsoft-com:office:word" xmlns:w="http://schemas.openxmlformats.org/wordprocessingml/2006/main" xmlns:w14="http://schemas.microsoft.com/office/word/2010/wordml" xmlns:w15="http://schemas.microsoft.com/office/word/2012/wordml" xmlns:w16cex="http://schemas.microsoft.com/office/word/2018/wordml/cex" xmlns:w16cid="http://schemas.microsoft.com/office/word/2016/wordml/cid" xmlns:w16="http://schemas.microsoft.com/office/word/2018/wordml" xmlns:w16du="http://schemas.microsoft.com/office/word/2023/wordml/word16du" xmlns:w16sdtdh="http://schemas.microsoft.com/office/word/2020/wordml/sdtdatahash" xmlns:w16sdtfl="http://schemas.microsoft.com/office/word/2024/wordml/sdtformatlock" xmlns:w16se="http://schemas.microsoft.com/office/word/2015/wordml/symex" xmlns:wpg="http://schemas.microsoft.com/office/word/2010/wordprocessingGroup" xmlns:wpi="http://schemas.microsoft.com/office/word/2010/wordprocessingInk" xmlns:wne="http://schemas.microsoft.com/office/word/2006/wordml" xmlns:wps="http://schemas.microsoft.com/office/word/2010/wordprocessingShape" mc:Ignorable="w14 w15 w16se w16cid w16 w16cex w16sdtdh w16sdtfl w16du wp14">
+<w:endnotes xmlns:wpc="http://schemas.microsoft.com/office/word/2010/wordprocessingCanvas" xmlns:cx="http://schemas.microsoft.com/office/drawing/2014/chartex" xmlns:cx1="http://schemas.microsoft.com/office/drawing/2015/9/8/chartex" xmlns:cx2="http://schemas.microsoft.com/office/drawing/2015/10/21/chartex" xmlns:cx3="http://schemas.microsoft.com/office/drawing/2016/5/9/chartex" xmlns:cx4="http://schemas.microsoft.com/office/drawing/2016/5/10/chartex" xmlns:cx5="http://schemas.microsoft.com/office/drawing/2016/5/11/chartex" xmlns:cx6="http://schemas.microsoft.com/office/drawing/2016/5/12/chartex" xmlns:cx7="http://schemas.microsoft.com/office/drawing/2016/5/13/chartex" xmlns:cx8="http://schemas.microsoft.com/office/drawing/2016/5/14/chartex" xmlns:mc="http://schemas.openxmlformats.org/markup-compatibility/2006" xmlns:m="http://schemas.openxmlformats.org/officeDocument/2006/math" xmlns:aink="http://schemas.microsoft.com/office/drawing/2016/ink" xmlns:am3d="http://schemas.microsoft.com/office/drawing/2017/model3d" xmlns:oel="http://schemas.microsoft.com/office/2019/extlst" xmlns:r="http://schemas.openxmlformats.org/officeDocument/2006/relationships" xmlns:wp14="http://schemas.microsoft.com/office/word/2010/wordprocessingDrawing" xmlns:wp="http://schemas.openxmlformats.org/drawingml/2006/wordprocessingDrawing" xmlns:wpg="http://schemas.microsoft.com/office/word/2010/wordprocessingGroup" xmlns:wpi="http://schemas.microsoft.com/office/word/2010/wordprocessingInk" xmlns:wps="http://schemas.microsoft.com/office/word/2010/wordprocessingShape" xmlns:o="urn:schemas-microsoft-com:office:office" xmlns:v="urn:schemas-microsoft-com:vml" xmlns:w10="urn:schemas-microsoft-com:office:word" xmlns:w="http://schemas.openxmlformats.org/wordprocessingml/2006/main" xmlns:w14="http://schemas.microsoft.com/office/word/2010/wordml" xmlns:w15="http://schemas.microsoft.com/office/word/2012/wordml" xmlns:w16cei="http://schemas.microsoft.com/office/word/2026/wordml/cei" xmlns:w16cex="http://schemas.microsoft.com/office/word/2018/wordml/cex" xmlns:w16cid="http://schemas.microsoft.com/office/word/2016/wordml/cid" xmlns:w16="http://schemas.microsoft.com/office/word/2018/wordml" xmlns:w16sdtdh="http://schemas.microsoft.com/office/word/2020/wordml/sdtdatahash" xmlns:w16sdtfl="http://schemas.microsoft.com/office/word/2024/wordml/sdtformatlock" xmlns:w16se="http://schemas.microsoft.com/office/word/2015/wordml/symex" xmlns:w16du="http://schemas.microsoft.com/office/word/2023/wordml/word16du" xmlns:wne="http://schemas.microsoft.com/office/word/2006/wordml" mc:Ignorable="w14 w15 w16se w16cid w16 w16cex w16sdtdh w16sdtfl w16du wp14">
   <w:endnote w:type="separator" w:id="-1">
     <w:p>
       <w:pPr>
@@ -2099,7 +2272,7 @@
 </file>
 
 <file path=word/footer1.xml><?xml version="1.0" encoding="utf-8"?>
-<w:ftr xmlns:wpc="http://schemas.microsoft.com/office/word/2010/wordprocessingCanvas" xmlns:cx="http://schemas.microsoft.com/office/drawing/2014/chartex" xmlns:cx1="http://schemas.microsoft.com/office/drawing/2015/9/8/chartex" xmlns:cx2="http://schemas.microsoft.com/office/drawing/2015/10/21/chartex" xmlns:cx3="http://schemas.microsoft.com/office/drawing/2016/5/9/chartex" xmlns:cx4="http://schemas.microsoft.com/office/drawing/2016/5/10/chartex" xmlns:cx5="http://schemas.microsoft.com/office/drawing/2016/5/11/chartex" xmlns:cx6="http://schemas.microsoft.com/office/drawing/2016/5/12/chartex" xmlns:cx7="http://schemas.microsoft.com/office/drawing/2016/5/13/chartex" xmlns:cx8="http://schemas.microsoft.com/office/drawing/2016/5/14/chartex" xmlns:mc="http://schemas.openxmlformats.org/markup-compatibility/2006" xmlns:aink="http://schemas.microsoft.com/office/drawing/2016/ink" xmlns:am3d="http://schemas.microsoft.com/office/drawing/2017/model3d" xmlns:o="urn:schemas-microsoft-com:office:office" xmlns:oel="http://schemas.microsoft.com/office/2019/extlst" xmlns:r="http://schemas.openxmlformats.org/officeDocument/2006/relationships" xmlns:m="http://schemas.openxmlformats.org/officeDocument/2006/math" xmlns:v="urn:schemas-microsoft-com:vml" xmlns:wp14="http://schemas.microsoft.com/office/word/2010/wordprocessingDrawing" xmlns:wp="http://schemas.openxmlformats.org/drawingml/2006/wordprocessingDrawing" xmlns:w10="urn:schemas-microsoft-com:office:word" xmlns:w="http://schemas.openxmlformats.org/wordprocessingml/2006/main" xmlns:w14="http://schemas.microsoft.com/office/word/2010/wordml" xmlns:w15="http://schemas.microsoft.com/office/word/2012/wordml" xmlns:w16cex="http://schemas.microsoft.com/office/word/2018/wordml/cex" xmlns:w16cid="http://schemas.microsoft.com/office/word/2016/wordml/cid" xmlns:w16="http://schemas.microsoft.com/office/word/2018/wordml" xmlns:w16du="http://schemas.microsoft.com/office/word/2023/wordml/word16du" xmlns:w16sdtdh="http://schemas.microsoft.com/office/word/2020/wordml/sdtdatahash" xmlns:w16sdtfl="http://schemas.microsoft.com/office/word/2024/wordml/sdtformatlock" xmlns:w16se="http://schemas.microsoft.com/office/word/2015/wordml/symex" xmlns:wpg="http://schemas.microsoft.com/office/word/2010/wordprocessingGroup" xmlns:wpi="http://schemas.microsoft.com/office/word/2010/wordprocessingInk" xmlns:wne="http://schemas.microsoft.com/office/word/2006/wordml" xmlns:wps="http://schemas.microsoft.com/office/word/2010/wordprocessingShape" mc:Ignorable="w14 w15 w16se w16cid w16 w16cex w16sdtdh w16sdtfl w16du wp14">
+<w:ftr xmlns:wpc="http://schemas.microsoft.com/office/word/2010/wordprocessingCanvas" xmlns:cx="http://schemas.microsoft.com/office/drawing/2014/chartex" xmlns:cx1="http://schemas.microsoft.com/office/drawing/2015/9/8/chartex" xmlns:cx2="http://schemas.microsoft.com/office/drawing/2015/10/21/chartex" xmlns:cx3="http://schemas.microsoft.com/office/drawing/2016/5/9/chartex" xmlns:cx4="http://schemas.microsoft.com/office/drawing/2016/5/10/chartex" xmlns:cx5="http://schemas.microsoft.com/office/drawing/2016/5/11/chartex" xmlns:cx6="http://schemas.microsoft.com/office/drawing/2016/5/12/chartex" xmlns:cx7="http://schemas.microsoft.com/office/drawing/2016/5/13/chartex" xmlns:cx8="http://schemas.microsoft.com/office/drawing/2016/5/14/chartex" xmlns:mc="http://schemas.openxmlformats.org/markup-compatibility/2006" xmlns:m="http://schemas.openxmlformats.org/officeDocument/2006/math" xmlns:aink="http://schemas.microsoft.com/office/drawing/2016/ink" xmlns:am3d="http://schemas.microsoft.com/office/drawing/2017/model3d" xmlns:oel="http://schemas.microsoft.com/office/2019/extlst" xmlns:r="http://schemas.openxmlformats.org/officeDocument/2006/relationships" xmlns:wp14="http://schemas.microsoft.com/office/word/2010/wordprocessingDrawing" xmlns:wp="http://schemas.openxmlformats.org/drawingml/2006/wordprocessingDrawing" xmlns:wpg="http://schemas.microsoft.com/office/word/2010/wordprocessingGroup" xmlns:wpi="http://schemas.microsoft.com/office/word/2010/wordprocessingInk" xmlns:wps="http://schemas.microsoft.com/office/word/2010/wordprocessingShape" xmlns:o="urn:schemas-microsoft-com:office:office" xmlns:v="urn:schemas-microsoft-com:vml" xmlns:w10="urn:schemas-microsoft-com:office:word" xmlns:w="http://schemas.openxmlformats.org/wordprocessingml/2006/main" xmlns:w14="http://schemas.microsoft.com/office/word/2010/wordml" xmlns:w15="http://schemas.microsoft.com/office/word/2012/wordml" xmlns:w16cei="http://schemas.microsoft.com/office/word/2026/wordml/cei" xmlns:w16cex="http://schemas.microsoft.com/office/word/2018/wordml/cex" xmlns:w16cid="http://schemas.microsoft.com/office/word/2016/wordml/cid" xmlns:w16="http://schemas.microsoft.com/office/word/2018/wordml" xmlns:w16sdtdh="http://schemas.microsoft.com/office/word/2020/wordml/sdtdatahash" xmlns:w16sdtfl="http://schemas.microsoft.com/office/word/2024/wordml/sdtformatlock" xmlns:w16se="http://schemas.microsoft.com/office/word/2015/wordml/symex" xmlns:w16du="http://schemas.microsoft.com/office/word/2023/wordml/word16du" xmlns:wne="http://schemas.microsoft.com/office/word/2006/wordml" mc:Ignorable="w14 w15 w16se w16cid w16 w16cex w16sdtdh w16sdtfl w16du wp14">
   <w:sdt>
     <w:sdtPr>
       <w:id w:val="1603763343"/>
@@ -2231,7 +2404,7 @@
 </file>
 
 <file path=word/footer2.xml><?xml version="1.0" encoding="utf-8"?>
-<w:ftr xmlns:wpc="http://schemas.microsoft.com/office/word/2010/wordprocessingCanvas" xmlns:cx="http://schemas.microsoft.com/office/drawing/2014/chartex" xmlns:cx1="http://schemas.microsoft.com/office/drawing/2015/9/8/chartex" xmlns:cx2="http://schemas.microsoft.com/office/drawing/2015/10/21/chartex" xmlns:cx3="http://schemas.microsoft.com/office/drawing/2016/5/9/chartex" xmlns:cx4="http://schemas.microsoft.com/office/drawing/2016/5/10/chartex" xmlns:cx5="http://schemas.microsoft.com/office/drawing/2016/5/11/chartex" xmlns:cx6="http://schemas.microsoft.com/office/drawing/2016/5/12/chartex" xmlns:cx7="http://schemas.microsoft.com/office/drawing/2016/5/13/chartex" xmlns:cx8="http://schemas.microsoft.com/office/drawing/2016/5/14/chartex" xmlns:mc="http://schemas.openxmlformats.org/markup-compatibility/2006" xmlns:aink="http://schemas.microsoft.com/office/drawing/2016/ink" xmlns:am3d="http://schemas.microsoft.com/office/drawing/2017/model3d" xmlns:o="urn:schemas-microsoft-com:office:office" xmlns:oel="http://schemas.microsoft.com/office/2019/extlst" xmlns:r="http://schemas.openxmlformats.org/officeDocument/2006/relationships" xmlns:m="http://schemas.openxmlformats.org/officeDocument/2006/math" xmlns:v="urn:schemas-microsoft-com:vml" xmlns:wp14="http://schemas.microsoft.com/office/word/2010/wordprocessingDrawing" xmlns:wp="http://schemas.openxmlformats.org/drawingml/2006/wordprocessingDrawing" xmlns:w10="urn:schemas-microsoft-com:office:word" xmlns:w="http://schemas.openxmlformats.org/wordprocessingml/2006/main" xmlns:w14="http://schemas.microsoft.com/office/word/2010/wordml" xmlns:w15="http://schemas.microsoft.com/office/word/2012/wordml" xmlns:w16cex="http://schemas.microsoft.com/office/word/2018/wordml/cex" xmlns:w16cid="http://schemas.microsoft.com/office/word/2016/wordml/cid" xmlns:w16="http://schemas.microsoft.com/office/word/2018/wordml" xmlns:w16du="http://schemas.microsoft.com/office/word/2023/wordml/word16du" xmlns:w16sdtdh="http://schemas.microsoft.com/office/word/2020/wordml/sdtdatahash" xmlns:w16sdtfl="http://schemas.microsoft.com/office/word/2024/wordml/sdtformatlock" xmlns:w16se="http://schemas.microsoft.com/office/word/2015/wordml/symex" xmlns:wpg="http://schemas.microsoft.com/office/word/2010/wordprocessingGroup" xmlns:wpi="http://schemas.microsoft.com/office/word/2010/wordprocessingInk" xmlns:wne="http://schemas.microsoft.com/office/word/2006/wordml" xmlns:wps="http://schemas.microsoft.com/office/word/2010/wordprocessingShape" mc:Ignorable="w14 w15 w16se w16cid w16 w16cex w16sdtdh w16sdtfl w16du wp14">
+<w:ftr xmlns:wpc="http://schemas.microsoft.com/office/word/2010/wordprocessingCanvas" xmlns:cx="http://schemas.microsoft.com/office/drawing/2014/chartex" xmlns:cx1="http://schemas.microsoft.com/office/drawing/2015/9/8/chartex" xmlns:cx2="http://schemas.microsoft.com/office/drawing/2015/10/21/chartex" xmlns:cx3="http://schemas.microsoft.com/office/drawing/2016/5/9/chartex" xmlns:cx4="http://schemas.microsoft.com/office/drawing/2016/5/10/chartex" xmlns:cx5="http://schemas.microsoft.com/office/drawing/2016/5/11/chartex" xmlns:cx6="http://schemas.microsoft.com/office/drawing/2016/5/12/chartex" xmlns:cx7="http://schemas.microsoft.com/office/drawing/2016/5/13/chartex" xmlns:cx8="http://schemas.microsoft.com/office/drawing/2016/5/14/chartex" xmlns:mc="http://schemas.openxmlformats.org/markup-compatibility/2006" xmlns:m="http://schemas.openxmlformats.org/officeDocument/2006/math" xmlns:aink="http://schemas.microsoft.com/office/drawing/2016/ink" xmlns:am3d="http://schemas.microsoft.com/office/drawing/2017/model3d" xmlns:oel="http://schemas.microsoft.com/office/2019/extlst" xmlns:r="http://schemas.openxmlformats.org/officeDocument/2006/relationships" xmlns:wp14="http://schemas.microsoft.com/office/word/2010/wordprocessingDrawing" xmlns:wp="http://schemas.openxmlformats.org/drawingml/2006/wordprocessingDrawing" xmlns:wpg="http://schemas.microsoft.com/office/word/2010/wordprocessingGroup" xmlns:wpi="http://schemas.microsoft.com/office/word/2010/wordprocessingInk" xmlns:wps="http://schemas.microsoft.com/office/word/2010/wordprocessingShape" xmlns:o="urn:schemas-microsoft-com:office:office" xmlns:v="urn:schemas-microsoft-com:vml" xmlns:w10="urn:schemas-microsoft-com:office:word" xmlns:w="http://schemas.openxmlformats.org/wordprocessingml/2006/main" xmlns:w14="http://schemas.microsoft.com/office/word/2010/wordml" xmlns:w15="http://schemas.microsoft.com/office/word/2012/wordml" xmlns:w16cei="http://schemas.microsoft.com/office/word/2026/wordml/cei" xmlns:w16cex="http://schemas.microsoft.com/office/word/2018/wordml/cex" xmlns:w16cid="http://schemas.microsoft.com/office/word/2016/wordml/cid" xmlns:w16="http://schemas.microsoft.com/office/word/2018/wordml" xmlns:w16sdtdh="http://schemas.microsoft.com/office/word/2020/wordml/sdtdatahash" xmlns:w16sdtfl="http://schemas.microsoft.com/office/word/2024/wordml/sdtformatlock" xmlns:w16se="http://schemas.microsoft.com/office/word/2015/wordml/symex" xmlns:w16du="http://schemas.microsoft.com/office/word/2023/wordml/word16du" xmlns:wne="http://schemas.microsoft.com/office/word/2006/wordml" mc:Ignorable="w14 w15 w16se w16cid w16 w16cex w16sdtdh w16sdtfl w16du wp14">
   <w:sdt>
     <w:sdtPr>
       <w:id w:val="-9535277"/>
@@ -2294,7 +2467,7 @@
 </file>
 
 <file path=word/footnotes.xml><?xml version="1.0" encoding="utf-8"?>
-<w:footnotes xmlns:wpc="http://schemas.microsoft.com/office/word/2010/wordprocessingCanvas" xmlns:cx="http://schemas.microsoft.com/office/drawing/2014/chartex" xmlns:cx1="http://schemas.microsoft.com/office/drawing/2015/9/8/chartex" xmlns:cx2="http://schemas.microsoft.com/office/drawing/2015/10/21/chartex" xmlns:cx3="http://schemas.microsoft.com/office/drawing/2016/5/9/chartex" xmlns:cx4="http://schemas.microsoft.com/office/drawing/2016/5/10/chartex" xmlns:cx5="http://schemas.microsoft.com/office/drawing/2016/5/11/chartex" xmlns:cx6="http://schemas.microsoft.com/office/drawing/2016/5/12/chartex" xmlns:cx7="http://schemas.microsoft.com/office/drawing/2016/5/13/chartex" xmlns:cx8="http://schemas.microsoft.com/office/drawing/2016/5/14/chartex" xmlns:mc="http://schemas.openxmlformats.org/markup-compatibility/2006" xmlns:aink="http://schemas.microsoft.com/office/drawing/2016/ink" xmlns:am3d="http://schemas.microsoft.com/office/drawing/2017/model3d" xmlns:o="urn:schemas-microsoft-com:office:office" xmlns:oel="http://schemas.microsoft.com/office/2019/extlst" xmlns:r="http://schemas.openxmlformats.org/officeDocument/2006/relationships" xmlns:m="http://schemas.openxmlformats.org/officeDocument/2006/math" xmlns:v="urn:schemas-microsoft-com:vml" xmlns:wp14="http://schemas.microsoft.com/office/word/2010/wordprocessingDrawing" xmlns:wp="http://schemas.openxmlformats.org/drawingml/2006/wordprocessingDrawing" xmlns:w10="urn:schemas-microsoft-com:office:word" xmlns:w="http://schemas.openxmlformats.org/wordprocessingml/2006/main" xmlns:w14="http://schemas.microsoft.com/office/word/2010/wordml" xmlns:w15="http://schemas.microsoft.com/office/word/2012/wordml" xmlns:w16cex="http://schemas.microsoft.com/office/word/2018/wordml/cex" xmlns:w16cid="http://schemas.microsoft.com/office/word/2016/wordml/cid" xmlns:w16="http://schemas.microsoft.com/office/word/2018/wordml" xmlns:w16du="http://schemas.microsoft.com/office/word/2023/wordml/word16du" xmlns:w16sdtdh="http://schemas.microsoft.com/office/word/2020/wordml/sdtdatahash" xmlns:w16sdtfl="http://schemas.microsoft.com/office/word/2024/wordml/sdtformatlock" xmlns:w16se="http://schemas.microsoft.com/office/word/2015/wordml/symex" xmlns:wpg="http://schemas.microsoft.com/office/word/2010/wordprocessingGroup" xmlns:wpi="http://schemas.microsoft.com/office/word/2010/wordprocessingInk" xmlns:wne="http://schemas.microsoft.com/office/word/2006/wordml" xmlns:wps="http://schemas.microsoft.com/office/word/2010/wordprocessingShape" mc:Ignorable="w14 w15 w16se w16cid w16 w16cex w16sdtdh w16sdtfl w16du wp14">
+<w:footnotes xmlns:wpc="http://schemas.microsoft.com/office/word/2010/wordprocessingCanvas" xmlns:cx="http://schemas.microsoft.com/office/drawing/2014/chartex" xmlns:cx1="http://schemas.microsoft.com/office/drawing/2015/9/8/chartex" xmlns:cx2="http://schemas.microsoft.com/office/drawing/2015/10/21/chartex" xmlns:cx3="http://schemas.microsoft.com/office/drawing/2016/5/9/chartex" xmlns:cx4="http://schemas.microsoft.com/office/drawing/2016/5/10/chartex" xmlns:cx5="http://schemas.microsoft.com/office/drawing/2016/5/11/chartex" xmlns:cx6="http://schemas.microsoft.com/office/drawing/2016/5/12/chartex" xmlns:cx7="http://schemas.microsoft.com/office/drawing/2016/5/13/chartex" xmlns:cx8="http://schemas.microsoft.com/office/drawing/2016/5/14/chartex" xmlns:mc="http://schemas.openxmlformats.org/markup-compatibility/2006" xmlns:m="http://schemas.openxmlformats.org/officeDocument/2006/math" xmlns:aink="http://schemas.microsoft.com/office/drawing/2016/ink" xmlns:am3d="http://schemas.microsoft.com/office/drawing/2017/model3d" xmlns:oel="http://schemas.microsoft.com/office/2019/extlst" xmlns:r="http://schemas.openxmlformats.org/officeDocument/2006/relationships" xmlns:wp14="http://schemas.microsoft.com/office/word/2010/wordprocessingDrawing" xmlns:wp="http://schemas.openxmlformats.org/drawingml/2006/wordprocessingDrawing" xmlns:wpg="http://schemas.microsoft.com/office/word/2010/wordprocessingGroup" xmlns:wpi="http://schemas.microsoft.com/office/word/2010/wordprocessingInk" xmlns:wps="http://schemas.microsoft.com/office/word/2010/wordprocessingShape" xmlns:o="urn:schemas-microsoft-com:office:office" xmlns:v="urn:schemas-microsoft-com:vml" xmlns:w10="urn:schemas-microsoft-com:office:word" xmlns:w="http://schemas.openxmlformats.org/wordprocessingml/2006/main" xmlns:w14="http://schemas.microsoft.com/office/word/2010/wordml" xmlns:w15="http://schemas.microsoft.com/office/word/2012/wordml" xmlns:w16cei="http://schemas.microsoft.com/office/word/2026/wordml/cei" xmlns:w16cex="http://schemas.microsoft.com/office/word/2018/wordml/cex" xmlns:w16cid="http://schemas.microsoft.com/office/word/2016/wordml/cid" xmlns:w16="http://schemas.microsoft.com/office/word/2018/wordml" xmlns:w16sdtdh="http://schemas.microsoft.com/office/word/2020/wordml/sdtdatahash" xmlns:w16sdtfl="http://schemas.microsoft.com/office/word/2024/wordml/sdtformatlock" xmlns:w16se="http://schemas.microsoft.com/office/word/2015/wordml/symex" xmlns:w16du="http://schemas.microsoft.com/office/word/2023/wordml/word16du" xmlns:wne="http://schemas.microsoft.com/office/word/2006/wordml" mc:Ignorable="w14 w15 w16se w16cid w16 w16cex w16sdtdh w16sdtfl w16du wp14">
   <w:footnote w:type="separator" w:id="-1">
     <w:p>
       <w:pPr>
@@ -2326,7 +2499,7 @@
 </file>
 
 <file path=word/header1.xml><?xml version="1.0" encoding="utf-8"?>
-<w:hdr xmlns:wpc="http://schemas.microsoft.com/office/word/2010/wordprocessingCanvas" xmlns:cx="http://schemas.microsoft.com/office/drawing/2014/chartex" xmlns:cx1="http://schemas.microsoft.com/office/drawing/2015/9/8/chartex" xmlns:cx2="http://schemas.microsoft.com/office/drawing/2015/10/21/chartex" xmlns:cx3="http://schemas.microsoft.com/office/drawing/2016/5/9/chartex" xmlns:cx4="http://schemas.microsoft.com/office/drawing/2016/5/10/chartex" xmlns:cx5="http://schemas.microsoft.com/office/drawing/2016/5/11/chartex" xmlns:cx6="http://schemas.microsoft.com/office/drawing/2016/5/12/chartex" xmlns:cx7="http://schemas.microsoft.com/office/drawing/2016/5/13/chartex" xmlns:cx8="http://schemas.microsoft.com/office/drawing/2016/5/14/chartex" xmlns:mc="http://schemas.openxmlformats.org/markup-compatibility/2006" xmlns:aink="http://schemas.microsoft.com/office/drawing/2016/ink" xmlns:am3d="http://schemas.microsoft.com/office/drawing/2017/model3d" xmlns:o="urn:schemas-microsoft-com:office:office" xmlns:oel="http://schemas.microsoft.com/office/2019/extlst" xmlns:r="http://schemas.openxmlformats.org/officeDocument/2006/relationships" xmlns:m="http://schemas.openxmlformats.org/officeDocument/2006/math" xmlns:v="urn:schemas-microsoft-com:vml" xmlns:wp14="http://schemas.microsoft.com/office/word/2010/wordprocessingDrawing" xmlns:wp="http://schemas.openxmlformats.org/drawingml/2006/wordprocessingDrawing" xmlns:w10="urn:schemas-microsoft-com:office:word" xmlns:w="http://schemas.openxmlformats.org/wordprocessingml/2006/main" xmlns:w14="http://schemas.microsoft.com/office/word/2010/wordml" xmlns:w15="http://schemas.microsoft.com/office/word/2012/wordml" xmlns:w16cex="http://schemas.microsoft.com/office/word/2018/wordml/cex" xmlns:w16cid="http://schemas.microsoft.com/office/word/2016/wordml/cid" xmlns:w16="http://schemas.microsoft.com/office/word/2018/wordml" xmlns:w16du="http://schemas.microsoft.com/office/word/2023/wordml/word16du" xmlns:w16sdtdh="http://schemas.microsoft.com/office/word/2020/wordml/sdtdatahash" xmlns:w16sdtfl="http://schemas.microsoft.com/office/word/2024/wordml/sdtformatlock" xmlns:w16se="http://schemas.microsoft.com/office/word/2015/wordml/symex" xmlns:wpg="http://schemas.microsoft.com/office/word/2010/wordprocessingGroup" xmlns:wpi="http://schemas.microsoft.com/office/word/2010/wordprocessingInk" xmlns:wne="http://schemas.microsoft.com/office/word/2006/wordml" xmlns:wps="http://schemas.microsoft.com/office/word/2010/wordprocessingShape" mc:Ignorable="w14 w15 w16se w16cid w16 w16cex w16sdtdh w16sdtfl w16du wp14">
+<w:hdr xmlns:wpc="http://schemas.microsoft.com/office/word/2010/wordprocessingCanvas" xmlns:cx="http://schemas.microsoft.com/office/drawing/2014/chartex" xmlns:cx1="http://schemas.microsoft.com/office/drawing/2015/9/8/chartex" xmlns:cx2="http://schemas.microsoft.com/office/drawing/2015/10/21/chartex" xmlns:cx3="http://schemas.microsoft.com/office/drawing/2016/5/9/chartex" xmlns:cx4="http://schemas.microsoft.com/office/drawing/2016/5/10/chartex" xmlns:cx5="http://schemas.microsoft.com/office/drawing/2016/5/11/chartex" xmlns:cx6="http://schemas.microsoft.com/office/drawing/2016/5/12/chartex" xmlns:cx7="http://schemas.microsoft.com/office/drawing/2016/5/13/chartex" xmlns:cx8="http://schemas.microsoft.com/office/drawing/2016/5/14/chartex" xmlns:mc="http://schemas.openxmlformats.org/markup-compatibility/2006" xmlns:m="http://schemas.openxmlformats.org/officeDocument/2006/math" xmlns:aink="http://schemas.microsoft.com/office/drawing/2016/ink" xmlns:am3d="http://schemas.microsoft.com/office/drawing/2017/model3d" xmlns:oel="http://schemas.microsoft.com/office/2019/extlst" xmlns:r="http://schemas.openxmlformats.org/officeDocument/2006/relationships" xmlns:wp14="http://schemas.microsoft.com/office/word/2010/wordprocessingDrawing" xmlns:wp="http://schemas.openxmlformats.org/drawingml/2006/wordprocessingDrawing" xmlns:wpg="http://schemas.microsoft.com/office/word/2010/wordprocessingGroup" xmlns:wpi="http://schemas.microsoft.com/office/word/2010/wordprocessingInk" xmlns:wps="http://schemas.microsoft.com/office/word/2010/wordprocessingShape" xmlns:o="urn:schemas-microsoft-com:office:office" xmlns:v="urn:schemas-microsoft-com:vml" xmlns:w10="urn:schemas-microsoft-com:office:word" xmlns:w="http://schemas.openxmlformats.org/wordprocessingml/2006/main" xmlns:w14="http://schemas.microsoft.com/office/word/2010/wordml" xmlns:w15="http://schemas.microsoft.com/office/word/2012/wordml" xmlns:w16cei="http://schemas.microsoft.com/office/word/2026/wordml/cei" xmlns:w16cex="http://schemas.microsoft.com/office/word/2018/wordml/cex" xmlns:w16cid="http://schemas.microsoft.com/office/word/2016/wordml/cid" xmlns:w16="http://schemas.microsoft.com/office/word/2018/wordml" xmlns:w16sdtdh="http://schemas.microsoft.com/office/word/2020/wordml/sdtdatahash" xmlns:w16sdtfl="http://schemas.microsoft.com/office/word/2024/wordml/sdtformatlock" xmlns:w16se="http://schemas.microsoft.com/office/word/2015/wordml/symex" xmlns:w16du="http://schemas.microsoft.com/office/word/2023/wordml/word16du" xmlns:wne="http://schemas.microsoft.com/office/word/2006/wordml" mc:Ignorable="w14 w15 w16se w16cid w16 w16cex w16sdtdh w16sdtfl w16du wp14">
   <w:p>
     <w:pPr>
       <w:spacing w:line="264" w:lineRule="auto"/>
@@ -2437,7 +2610,7 @@
 </file>
 
 <file path=word/header2.xml><?xml version="1.0" encoding="utf-8"?>
-<w:hdr xmlns:wpc="http://schemas.microsoft.com/office/word/2010/wordprocessingCanvas" xmlns:cx="http://schemas.microsoft.com/office/drawing/2014/chartex" xmlns:cx1="http://schemas.microsoft.com/office/drawing/2015/9/8/chartex" xmlns:cx2="http://schemas.microsoft.com/office/drawing/2015/10/21/chartex" xmlns:cx3="http://schemas.microsoft.com/office/drawing/2016/5/9/chartex" xmlns:cx4="http://schemas.microsoft.com/office/drawing/2016/5/10/chartex" xmlns:cx5="http://schemas.microsoft.com/office/drawing/2016/5/11/chartex" xmlns:cx6="http://schemas.microsoft.com/office/drawing/2016/5/12/chartex" xmlns:cx7="http://schemas.microsoft.com/office/drawing/2016/5/13/chartex" xmlns:cx8="http://schemas.microsoft.com/office/drawing/2016/5/14/chartex" xmlns:mc="http://schemas.openxmlformats.org/markup-compatibility/2006" xmlns:aink="http://schemas.microsoft.com/office/drawing/2016/ink" xmlns:am3d="http://schemas.microsoft.com/office/drawing/2017/model3d" xmlns:o="urn:schemas-microsoft-com:office:office" xmlns:oel="http://schemas.microsoft.com/office/2019/extlst" xmlns:r="http://schemas.openxmlformats.org/officeDocument/2006/relationships" xmlns:m="http://schemas.openxmlformats.org/officeDocument/2006/math" xmlns:v="urn:schemas-microsoft-com:vml" xmlns:wp14="http://schemas.microsoft.com/office/word/2010/wordprocessingDrawing" xmlns:wp="http://schemas.openxmlformats.org/drawingml/2006/wordprocessingDrawing" xmlns:w10="urn:schemas-microsoft-com:office:word" xmlns:w="http://schemas.openxmlformats.org/wordprocessingml/2006/main" xmlns:w14="http://schemas.microsoft.com/office/word/2010/wordml" xmlns:w15="http://schemas.microsoft.com/office/word/2012/wordml" xmlns:w16cex="http://schemas.microsoft.com/office/word/2018/wordml/cex" xmlns:w16cid="http://schemas.microsoft.com/office/word/2016/wordml/cid" xmlns:w16="http://schemas.microsoft.com/office/word/2018/wordml" xmlns:w16du="http://schemas.microsoft.com/office/word/2023/wordml/word16du" xmlns:w16sdtdh="http://schemas.microsoft.com/office/word/2020/wordml/sdtdatahash" xmlns:w16sdtfl="http://schemas.microsoft.com/office/word/2024/wordml/sdtformatlock" xmlns:w16se="http://schemas.microsoft.com/office/word/2015/wordml/symex" xmlns:wpg="http://schemas.microsoft.com/office/word/2010/wordprocessingGroup" xmlns:wpi="http://schemas.microsoft.com/office/word/2010/wordprocessingInk" xmlns:wne="http://schemas.microsoft.com/office/word/2006/wordml" xmlns:wps="http://schemas.microsoft.com/office/word/2010/wordprocessingShape" mc:Ignorable="w14 w15 w16se w16cid w16 w16cex w16sdtdh w16sdtfl w16du wp14">
+<w:hdr xmlns:wpc="http://schemas.microsoft.com/office/word/2010/wordprocessingCanvas" xmlns:cx="http://schemas.microsoft.com/office/drawing/2014/chartex" xmlns:cx1="http://schemas.microsoft.com/office/drawing/2015/9/8/chartex" xmlns:cx2="http://schemas.microsoft.com/office/drawing/2015/10/21/chartex" xmlns:cx3="http://schemas.microsoft.com/office/drawing/2016/5/9/chartex" xmlns:cx4="http://schemas.microsoft.com/office/drawing/2016/5/10/chartex" xmlns:cx5="http://schemas.microsoft.com/office/drawing/2016/5/11/chartex" xmlns:cx6="http://schemas.microsoft.com/office/drawing/2016/5/12/chartex" xmlns:cx7="http://schemas.microsoft.com/office/drawing/2016/5/13/chartex" xmlns:cx8="http://schemas.microsoft.com/office/drawing/2016/5/14/chartex" xmlns:mc="http://schemas.openxmlformats.org/markup-compatibility/2006" xmlns:m="http://schemas.openxmlformats.org/officeDocument/2006/math" xmlns:aink="http://schemas.microsoft.com/office/drawing/2016/ink" xmlns:am3d="http://schemas.microsoft.com/office/drawing/2017/model3d" xmlns:oel="http://schemas.microsoft.com/office/2019/extlst" xmlns:r="http://schemas.openxmlformats.org/officeDocument/2006/relationships" xmlns:wp14="http://schemas.microsoft.com/office/word/2010/wordprocessingDrawing" xmlns:wp="http://schemas.openxmlformats.org/drawingml/2006/wordprocessingDrawing" xmlns:wpg="http://schemas.microsoft.com/office/word/2010/wordprocessingGroup" xmlns:wpi="http://schemas.microsoft.com/office/word/2010/wordprocessingInk" xmlns:wps="http://schemas.microsoft.com/office/word/2010/wordprocessingShape" xmlns:o="urn:schemas-microsoft-com:office:office" xmlns:v="urn:schemas-microsoft-com:vml" xmlns:w10="urn:schemas-microsoft-com:office:word" xmlns:w="http://schemas.openxmlformats.org/wordprocessingml/2006/main" xmlns:w14="http://schemas.microsoft.com/office/word/2010/wordml" xmlns:w15="http://schemas.microsoft.com/office/word/2012/wordml" xmlns:w16cei="http://schemas.microsoft.com/office/word/2026/wordml/cei" xmlns:w16cex="http://schemas.microsoft.com/office/word/2018/wordml/cex" xmlns:w16cid="http://schemas.microsoft.com/office/word/2016/wordml/cid" xmlns:w16="http://schemas.microsoft.com/office/word/2018/wordml" xmlns:w16sdtdh="http://schemas.microsoft.com/office/word/2020/wordml/sdtdatahash" xmlns:w16sdtfl="http://schemas.microsoft.com/office/word/2024/wordml/sdtformatlock" xmlns:w16se="http://schemas.microsoft.com/office/word/2015/wordml/symex" xmlns:w16du="http://schemas.microsoft.com/office/word/2023/wordml/word16du" xmlns:wne="http://schemas.microsoft.com/office/word/2006/wordml" mc:Ignorable="w14 w15 w16se w16cid w16 w16cex w16sdtdh w16sdtfl w16du wp14">
   <w:p>
     <w:pPr>
       <w:pStyle w:val="Header"/>
@@ -2516,7 +2689,7 @@
 </file>
 
 <file path=word/numbering.xml><?xml version="1.0" encoding="utf-8"?>
-<w:numbering xmlns:wpc="http://schemas.microsoft.com/office/word/2010/wordprocessingCanvas" xmlns:cx="http://schemas.microsoft.com/office/drawing/2014/chartex" xmlns:cx1="http://schemas.microsoft.com/office/drawing/2015/9/8/chartex" xmlns:cx2="http://schemas.microsoft.com/office/drawing/2015/10/21/chartex" xmlns:cx3="http://schemas.microsoft.com/office/drawing/2016/5/9/chartex" xmlns:cx4="http://schemas.microsoft.com/office/drawing/2016/5/10/chartex" xmlns:cx5="http://schemas.microsoft.com/office/drawing/2016/5/11/chartex" xmlns:cx6="http://schemas.microsoft.com/office/drawing/2016/5/12/chartex" xmlns:cx7="http://schemas.microsoft.com/office/drawing/2016/5/13/chartex" xmlns:cx8="http://schemas.microsoft.com/office/drawing/2016/5/14/chartex" xmlns:mc="http://schemas.openxmlformats.org/markup-compatibility/2006" xmlns:aink="http://schemas.microsoft.com/office/drawing/2016/ink" xmlns:am3d="http://schemas.microsoft.com/office/drawing/2017/model3d" xmlns:o="urn:schemas-microsoft-com:office:office" xmlns:oel="http://schemas.microsoft.com/office/2019/extlst" xmlns:r="http://schemas.openxmlformats.org/officeDocument/2006/relationships" xmlns:m="http://schemas.openxmlformats.org/officeDocument/2006/math" xmlns:v="urn:schemas-microsoft-com:vml" xmlns:wp14="http://schemas.microsoft.com/office/word/2010/wordprocessingDrawing" xmlns:wp="http://schemas.openxmlformats.org/drawingml/2006/wordprocessingDrawing" xmlns:w10="urn:schemas-microsoft-com:office:word" xmlns:w="http://schemas.openxmlformats.org/wordprocessingml/2006/main" xmlns:w14="http://schemas.microsoft.com/office/word/2010/wordml" xmlns:w15="http://schemas.microsoft.com/office/word/2012/wordml" xmlns:w16cex="http://schemas.microsoft.com/office/word/2018/wordml/cex" xmlns:w16cid="http://schemas.microsoft.com/office/word/2016/wordml/cid" xmlns:w16="http://schemas.microsoft.com/office/word/2018/wordml" xmlns:w16du="http://schemas.microsoft.com/office/word/2023/wordml/word16du" xmlns:w16sdtdh="http://schemas.microsoft.com/office/word/2020/wordml/sdtdatahash" xmlns:w16sdtfl="http://schemas.microsoft.com/office/word/2024/wordml/sdtformatlock" xmlns:w16se="http://schemas.microsoft.com/office/word/2015/wordml/symex" xmlns:wpg="http://schemas.microsoft.com/office/word/2010/wordprocessingGroup" xmlns:wpi="http://schemas.microsoft.com/office/word/2010/wordprocessingInk" xmlns:wne="http://schemas.microsoft.com/office/word/2006/wordml" xmlns:wps="http://schemas.microsoft.com/office/word/2010/wordprocessingShape" mc:Ignorable="w14 w15 w16se w16cid w16 w16cex w16sdtdh w16sdtfl w16du wp14">
+<w:numbering xmlns:wpc="http://schemas.microsoft.com/office/word/2010/wordprocessingCanvas" xmlns:cx="http://schemas.microsoft.com/office/drawing/2014/chartex" xmlns:cx1="http://schemas.microsoft.com/office/drawing/2015/9/8/chartex" xmlns:cx2="http://schemas.microsoft.com/office/drawing/2015/10/21/chartex" xmlns:cx3="http://schemas.microsoft.com/office/drawing/2016/5/9/chartex" xmlns:cx4="http://schemas.microsoft.com/office/drawing/2016/5/10/chartex" xmlns:cx5="http://schemas.microsoft.com/office/drawing/2016/5/11/chartex" xmlns:cx6="http://schemas.microsoft.com/office/drawing/2016/5/12/chartex" xmlns:cx7="http://schemas.microsoft.com/office/drawing/2016/5/13/chartex" xmlns:cx8="http://schemas.microsoft.com/office/drawing/2016/5/14/chartex" xmlns:mc="http://schemas.openxmlformats.org/markup-compatibility/2006" xmlns:m="http://schemas.openxmlformats.org/officeDocument/2006/math" xmlns:aink="http://schemas.microsoft.com/office/drawing/2016/ink" xmlns:am3d="http://schemas.microsoft.com/office/drawing/2017/model3d" xmlns:oel="http://schemas.microsoft.com/office/2019/extlst" xmlns:r="http://schemas.openxmlformats.org/officeDocument/2006/relationships" xmlns:wp14="http://schemas.microsoft.com/office/word/2010/wordprocessingDrawing" xmlns:wp="http://schemas.openxmlformats.org/drawingml/2006/wordprocessingDrawing" xmlns:wpg="http://schemas.microsoft.com/office/word/2010/wordprocessingGroup" xmlns:wpi="http://schemas.microsoft.com/office/word/2010/wordprocessingInk" xmlns:wps="http://schemas.microsoft.com/office/word/2010/wordprocessingShape" xmlns:o="urn:schemas-microsoft-com:office:office" xmlns:v="urn:schemas-microsoft-com:vml" xmlns:w10="urn:schemas-microsoft-com:office:word" xmlns:w="http://schemas.openxmlformats.org/wordprocessingml/2006/main" xmlns:w14="http://schemas.microsoft.com/office/word/2010/wordml" xmlns:w15="http://schemas.microsoft.com/office/word/2012/wordml" xmlns:w16cei="http://schemas.microsoft.com/office/word/2026/wordml/cei" xmlns:w16cex="http://schemas.microsoft.com/office/word/2018/wordml/cex" xmlns:w16cid="http://schemas.microsoft.com/office/word/2016/wordml/cid" xmlns:w16="http://schemas.microsoft.com/office/word/2018/wordml" xmlns:w16sdtdh="http://schemas.microsoft.com/office/word/2020/wordml/sdtdatahash" xmlns:w16sdtfl="http://schemas.microsoft.com/office/word/2024/wordml/sdtformatlock" xmlns:w16se="http://schemas.microsoft.com/office/word/2015/wordml/symex" xmlns:w16du="http://schemas.microsoft.com/office/word/2023/wordml/word16du" xmlns:wne="http://schemas.microsoft.com/office/word/2006/wordml" mc:Ignorable="w14 w15 w16se w16cid w16 w16cex w16sdtdh w16sdtfl w16du wp14">
   <w:abstractNum w:abstractNumId="0" w15:restartNumberingAfterBreak="0">
     <w:nsid w:val="030E7D54"/>
     <w:multiLevelType w:val="hybridMultilevel"/>
@@ -7102,7 +7275,7 @@
 </file>
 
 <file path=word/styles.xml><?xml version="1.0" encoding="utf-8"?>
-<w:styles xmlns:mc="http://schemas.openxmlformats.org/markup-compatibility/2006" xmlns:r="http://schemas.openxmlformats.org/officeDocument/2006/relationships" xmlns:w="http://schemas.openxmlformats.org/wordprocessingml/2006/main" xmlns:w14="http://schemas.microsoft.com/office/word/2010/wordml" xmlns:w15="http://schemas.microsoft.com/office/word/2012/wordml" xmlns:w16cex="http://schemas.microsoft.com/office/word/2018/wordml/cex" xmlns:w16cid="http://schemas.microsoft.com/office/word/2016/wordml/cid" xmlns:w16="http://schemas.microsoft.com/office/word/2018/wordml" xmlns:w16du="http://schemas.microsoft.com/office/word/2023/wordml/word16du" xmlns:w16sdtdh="http://schemas.microsoft.com/office/word/2020/wordml/sdtdatahash" xmlns:w16sdtfl="http://schemas.microsoft.com/office/word/2024/wordml/sdtformatlock" xmlns:w16se="http://schemas.microsoft.com/office/word/2015/wordml/symex" mc:Ignorable="w14 w15 w16se w16cid w16 w16cex w16sdtdh w16sdtfl w16du">
+<w:styles xmlns:mc="http://schemas.openxmlformats.org/markup-compatibility/2006" xmlns:r="http://schemas.openxmlformats.org/officeDocument/2006/relationships" xmlns:w="http://schemas.openxmlformats.org/wordprocessingml/2006/main" xmlns:w14="http://schemas.microsoft.com/office/word/2010/wordml" xmlns:w15="http://schemas.microsoft.com/office/word/2012/wordml" xmlns:w16cex="http://schemas.microsoft.com/office/word/2018/wordml/cex" xmlns:w16cid="http://schemas.microsoft.com/office/word/2016/wordml/cid" xmlns:w16="http://schemas.microsoft.com/office/word/2018/wordml" xmlns:w16sdtdh="http://schemas.microsoft.com/office/word/2020/wordml/sdtdatahash" xmlns:w16sdtfl="http://schemas.microsoft.com/office/word/2024/wordml/sdtformatlock" xmlns:w16se="http://schemas.microsoft.com/office/word/2015/wordml/symex" xmlns:w16du="http://schemas.microsoft.com/office/word/2023/wordml/word16du" mc:Ignorable="w14 w15 w16se w16cid w16 w16cex w16sdtdh w16sdtfl w16du">
   <w:docDefaults>
     <w:rPrDefault>
       <w:rPr>
@@ -8465,6 +8638,19 @@
       <w:shd w:val="clear" w:color="auto" w:fill="E1DFDD"/>
     </w:rPr>
   </w:style>
+  <w:style w:type="paragraph" w:styleId="Revision">
+    <w:name w:val="Revision"/>
+    <w:hidden/>
+    <w:uiPriority w:val="99"/>
+    <w:semiHidden/>
+    <w:rsid w:val="00D336FD"/>
+    <w:pPr>
+      <w:spacing w:after="0" w:line="240" w:lineRule="auto"/>
+    </w:pPr>
+    <w:rPr>
+      <w:sz w:val="26"/>
+    </w:rPr>
+  </w:style>
 </w:styles>
 </file>
 

</xml_diff>